<commit_message>
Streamlit-only app: drop FastAPI/legacy frontend, self-contained db layer, 10-test suite, updated report
</commit_message>
<xml_diff>
--- a/REPORT_FINAL/25WU0102114_Prajvesh_DBMS_PBL_Report.docx
+++ b/REPORT_FINAL/25WU0102114_Prajvesh_DBMS_PBL_Report.docx
@@ -1276,7 +1276,7 @@
         </w:rPr>
       </w:pPr>
       <w:r>
-        <w:t>I undertake that the project report, database design, SQL scripts, application source code, results, and supporting materials submitted by me have been prepared for academic purposes. Wherever information, ideas, tools, datasets, or other resources have been referred to, appropriate acknowledgement has been given. The MySQL 8 documentation, FastAPI documentation, and standard DBMS textbooks consulted are cited in the References [5]-[8].</w:t>
+        <w:t>I undertake that the project report, database design, SQL scripts, application source code, results, and supporting materials submitted by me have been prepared for academic purposes. Wherever information, ideas, tools, datasets, or other resources have been referred to, appropriate acknowledgement has been given. The MySQL 8 documentation, Streamlit documentation, and standard DBMS textbooks consulted are cited in the References [5]-[7].</w:t>
       </w:r>
     </w:p>
     <w:p>
@@ -5097,7 +5097,7 @@
           </w:tcPr>
           <w:p>
             <w:r>
-              <w:t>Automated test evidence (13/13 passed)</w:t>
+              <w:t>Automated test evidence (10/10 passed)</w:t>
             </w:r>
           </w:p>
         </w:tc>
@@ -5157,7 +5157,7 @@
           </w:tcPr>
           <w:p>
             <w:r>
-              <w:t>Late-return trigger block evidence</w:t>
+              <w:t>Streamlit late-return trigger block evidence</w:t>
             </w:r>
           </w:p>
         </w:tc>
@@ -5508,7 +5508,7 @@
           </w:tcPr>
           <w:p>
             <w:r>
-              <w:t>JWT</w:t>
+              <w:t>RBAC</w:t>
             </w:r>
           </w:p>
         </w:tc>
@@ -5519,61 +5519,7 @@
           </w:tcPr>
           <w:p>
             <w:r>
-              <w:t>JSON Web Token</w:t>
-            </w:r>
-          </w:p>
-        </w:tc>
-      </w:tr>
-      <w:tr>
-        <w:trPr>
-          <w:jc w:val="center"/>
-        </w:trPr>
-        <w:tc>
-          <w:tcPr>
-            <w:tcW w:w="2160" w:type="dxa"/>
-            <w:vAlign w:val="center"/>
-          </w:tcPr>
-          <w:p>
-            <w:r>
-              <w:t>RBAC</w:t>
-            </w:r>
-          </w:p>
-        </w:tc>
-        <w:tc>
-          <w:tcPr>
-            <w:tcW w:w="8208" w:type="dxa"/>
-            <w:vAlign w:val="center"/>
-          </w:tcPr>
-          <w:p>
-            <w:r>
               <w:t>Role-Based Access Control</w:t>
-            </w:r>
-          </w:p>
-        </w:tc>
-      </w:tr>
-      <w:tr>
-        <w:trPr>
-          <w:jc w:val="center"/>
-        </w:trPr>
-        <w:tc>
-          <w:tcPr>
-            <w:tcW w:w="2160" w:type="dxa"/>
-            <w:vAlign w:val="center"/>
-          </w:tcPr>
-          <w:p>
-            <w:r>
-              <w:t>SPA</w:t>
-            </w:r>
-          </w:p>
-        </w:tc>
-        <w:tc>
-          <w:tcPr>
-            <w:tcW w:w="8208" w:type="dxa"/>
-            <w:vAlign w:val="center"/>
-          </w:tcPr>
-          <w:p>
-            <w:r>
-              <w:t>Single Page Application</w:t>
             </w:r>
           </w:p>
         </w:tc>
@@ -6080,7 +6026,7 @@
         </w:rPr>
       </w:pPr>
       <w:r>
-        <w:t>E-commerce post-purchase operations routinely fail when orders, returns, and refunds are tracked in disconnected spreadsheets, causing untracked status changes, duplicate refunds, and missing audit evidence. The objective of this project is to design and implement a centralized ACID-compliant DBMS for the complete order-to-refund lifecycle. The solution uses a 13-table Third Normal Form (3NF) MySQL 8 (InnoDB) schema covering customers, products, inventory, orders, payments, item-level returns, warehouse inspection, refunds, and an immutable audit log; five triggers enforce return-window eligibility, return-quantity limits, strict state transitions, and automatic auditing; and one stored procedure, sp_process_refund, executes atomic refund processing with duplicate-refund prevention and full rollback on error [5], [7]. A role-based Streamlit application connects directly to the database with parameterized SQL to implement ordering, returning, approving, receiving, inspecting, refunding, auditing, and analytics, while the FastAPI service is retained as the automated test and benchmark harness [6], [9]. The completed system demonstrates the full lifecycle Order → Requested → Approved → Received → Inspected → Refunded, passes 13/13 automated tests, sustains sub-millisecond indexed lookups at 1K scale, and verifies backup/restore integrity at 111,025 orders. The application provides a single queryable source of truth for post-purchase operations with enforced business rules and traceable refunds.</w:t>
+        <w:t>E-commerce post-purchase operations routinely fail when orders, returns, and refunds are tracked in disconnected spreadsheets, causing untracked status changes, duplicate refunds, and missing audit evidence. The objective of this project is to design and implement a centralized ACID-compliant DBMS for the complete order-to-refund lifecycle. The solution uses a 13-table Third Normal Form (3NF) MySQL 8 (InnoDB) schema covering customers, products, inventory, orders, payments, item-level returns, warehouse inspection, refunds, and an immutable audit log; five triggers enforce return-window eligibility, return-quantity limits, strict state transitions, and automatic auditing; and one stored procedure, sp_process_refund, executes atomic refund processing with duplicate-refund prevention and full rollback on error [5], [6]. A role-based Streamlit application implements ordering, returning, approving, receiving, inspecting, refunding, auditing, and analytics through direct parameterized SQL, with session-state RBAC for Customer, Support, Warehouse, and Admin [7]. The completed system demonstrates the full lifecycle Order → Requested → Approved → Received → Inspected → Refunded, passes 10/10 automated pytest cases, sustains sub-millisecond indexed lookups at 1K scale, and verifies backup/restore integrity at 111,025 orders. The application provides a single queryable source of truth for post-purchase operations with enforced business rules and traceable refunds.</w:t>
       </w:r>
     </w:p>
     <w:p>
@@ -6332,7 +6278,7 @@
         </w:rPr>
       </w:pPr>
       <w:r>
-        <w:t>Develop a role-based Streamlit application with direct parameterized-SQL connectivity and session-state RBAC for Customer, Support, Warehouse, and Admin, covering ordering, returns, inspection, refunds, analytics, and audit, while retaining FastAPI as the automated test/benchmark harness.</w:t>
+        <w:t>Develop a role-based Streamlit application with direct parameterized-SQL connectivity and session-state RBAC for Customer, Support, Warehouse, and Admin, covering ordering, returns, inspection, refunds, analytics, and audit.</w:t>
       </w:r>
     </w:p>
     <w:p>
@@ -6344,7 +6290,7 @@
         </w:rPr>
       </w:pPr>
       <w:r>
-        <w:t>Validate the system with 13 automated tests (100% pass) covering constraints, procedure logic, full lifecycle integration, rollback, and concurrent duplicate-refund handling.</w:t>
+        <w:t>Validate the system with 10 automated pytest cases (100% pass) covering engine constraints, procedure guards, full lifecycle, rollback, duplicate prevention, and auth/RBAC.</w:t>
       </w:r>
     </w:p>
     <w:p>
@@ -6368,7 +6314,7 @@
         </w:rPr>
       </w:pPr>
       <w:r>
-        <w:t>Validate the system with 13 automated tests (100% pass) covering constraints, procedure logic, full lifecycle integration, rollback, and concurrent duplicate-refund handling.</w:t>
+        <w:t>Validate the system with 10 automated pytest cases (100% pass) covering engine constraints, procedure guards, full lifecycle, rollback, duplicate prevention, and auth/RBAC.</w:t>
       </w:r>
     </w:p>
     <w:p>
@@ -13610,7 +13556,7 @@
         </w:rPr>
       </w:pPr>
       <w:r>
-        <w:t>The application was re-implemented in Streamlit as a role-based multi-page app that connects directly to MySQL 8 with parameterized SQL in streamlit_app/db_ops.py: login is verified with bcrypt against AppUser⋈Role and the session role gates six pages (Customer Portal, Operations, Refunds, Analytics, Audit Log, Lifecycle Demo). Every screen operation maps to the 3NF schema in Chapter 2: ordering inserts Orders/OrderItem/Payment in one explicit transaction, returning inserts ReturnRequest/ReturnItem (trigger-validated), approvals/receives/inspections are constrained UPDATEs/INSERTs, and refunds execute only through sp_process_refund. Analytics screens run the six catalogued JOIN/GROUP BY queries with st.metric/st.bar_chart/st.dataframe, and the Admin audit page reads AuditLog. The FastAPI service is retained unchanged as the automated test and benchmark harness (17 endpoints), so all API evidence stays valid [6], [9]. No screen uses isolated or static data.</w:t>
+        <w:t>The application is a role-based Streamlit multi-page app that connects directly to MySQL 8 with parameterized SQL in streamlit_app/db_ops.py: login is verified with bcrypt against AppUser⋈Role and the session role gates six pages (Customer Portal, Operations, Refunds, Analytics, Audit Log, Lifecycle Demo). Every screen operation maps to the 3NF schema in Chapter 2: ordering inserts Orders/OrderItem/Payment in one explicit transaction, returning inserts ReturnRequest/ReturnItem (trigger-validated), approvals/receives/inspections are constrained UPDATEs/INSERTs, and refunds execute only through sp_process_refund. Analytics screens run the six catalogued JOIN/GROUP BY queries with st.metric/st.bar_chart/st.dataframe, and the Admin audit page reads AuditLog. Validation is performed by the pytest suite in tests/test_streamlit_ops.py (TC-01–TC-10), which drives the same database code the UI uses [7]. No screen uses isolated or static data.</w:t>
       </w:r>
     </w:p>
     <w:p>
@@ -13782,7 +13728,7 @@
           </w:tcPr>
           <w:p>
             <w:r>
-              <w:t>Streamlit 1.65 (application) + FastAPI/Uvicorn (retained test &amp; benchmark harness); bcrypt; session-state RBAC</w:t>
+              <w:t>Streamlit 1.65 (six role-gated pages); bcrypt auth; session-state RBAC</w:t>
             </w:r>
           </w:p>
         </w:tc>
@@ -13866,7 +13812,7 @@
           </w:tcPr>
           <w:p>
             <w:r>
-              <w:t>ecommerce_refund_dbms/streamlit_app/ (app.py, db_ops.py) + backend/ (harness), frontend/index.html (legacy SPA), tests/test_streamlit_ops.py</w:t>
+              <w:t>ecommerce_refund_dbms/streamlit_app/ (app.py, db_ops.py, database.py, auth.py, payment_gateway.py), tests/test_streamlit_ops.py (TC-01–TC-10)</w:t>
             </w:r>
           </w:p>
         </w:tc>
@@ -15153,7 +15099,7 @@
           </w:tcPr>
           <w:p>
             <w:r>
-              <w:t>mysql-connector %s parameterized queries; bcrypt; JWT require_roles; @current_app_user for audit actor</w:t>
+              <w:t>Destructive/terminal actions confirmed in UI; terminal states frozen by trigger</w:t>
             </w:r>
           </w:p>
         </w:tc>
@@ -15163,7 +15109,7 @@
           </w:tcPr>
           <w:p>
             <w:r>
-              <w:t>401 bad login; 403 /api/audit for non-admin (Fig. access_denied_403)</w:t>
+              <w:t>Rejected/Refunded returns cannot move; TC-05 RESTRICT delete blocked</w:t>
             </w:r>
           </w:p>
         </w:tc>
@@ -16095,14 +16041,9 @@
         </w:tc>
       </w:tr>
       <w:tr>
-        <w:trPr>
-          <w:trHeight w:val="425"/>
-          <w:jc w:val="center"/>
-        </w:trPr>
-        <w:tc>
-          <w:tcPr>
-            <w:tcW w:w="1601" w:type="dxa"/>
-            <w:vAlign w:val="center"/>
+        <w:tc>
+          <w:tcPr>
+            <w:tcW w:type="dxa" w:w="1525"/>
           </w:tcPr>
           <w:p>
             <w:r>
@@ -16112,8 +16053,7 @@
         </w:tc>
         <w:tc>
           <w:tcPr>
-            <w:tcW w:w="1601" w:type="dxa"/>
-            <w:vAlign w:val="center"/>
+            <w:tcW w:type="dxa" w:w="1547"/>
           </w:tcPr>
           <w:p>
             <w:r>
@@ -16123,8 +16063,7 @@
         </w:tc>
         <w:tc>
           <w:tcPr>
-            <w:tcW w:w="1601" w:type="dxa"/>
-            <w:vAlign w:val="center"/>
+            <w:tcW w:type="dxa" w:w="1540"/>
           </w:tcPr>
           <w:p>
             <w:r>
@@ -16134,8 +16073,7 @@
         </w:tc>
         <w:tc>
           <w:tcPr>
-            <w:tcW w:w="1601" w:type="dxa"/>
-            <w:vAlign w:val="center"/>
+            <w:tcW w:type="dxa" w:w="1556"/>
           </w:tcPr>
           <w:p>
             <w:r>
@@ -16145,8 +16083,7 @@
         </w:tc>
         <w:tc>
           <w:tcPr>
-            <w:tcW w:w="1601" w:type="dxa"/>
-            <w:vAlign w:val="center"/>
+            <w:tcW w:type="dxa" w:w="1540"/>
           </w:tcPr>
           <w:p>
             <w:r>
@@ -16156,8 +16093,7 @@
         </w:tc>
         <w:tc>
           <w:tcPr>
-            <w:tcW w:w="1601" w:type="dxa"/>
-            <w:vAlign w:val="center"/>
+            <w:tcW w:type="dxa" w:w="1537"/>
           </w:tcPr>
           <w:p>
             <w:r>
@@ -16167,14 +16103,9 @@
         </w:tc>
       </w:tr>
       <w:tr>
-        <w:trPr>
-          <w:trHeight w:val="425"/>
-          <w:jc w:val="center"/>
-        </w:trPr>
-        <w:tc>
-          <w:tcPr>
-            <w:tcW w:w="1601" w:type="dxa"/>
-            <w:vAlign w:val="center"/>
+        <w:tc>
+          <w:tcPr>
+            <w:tcW w:type="dxa" w:w="1525"/>
           </w:tcPr>
           <w:p>
             <w:r>
@@ -16184,8 +16115,7 @@
         </w:tc>
         <w:tc>
           <w:tcPr>
-            <w:tcW w:w="1601" w:type="dxa"/>
-            <w:vAlign w:val="center"/>
+            <w:tcW w:type="dxa" w:w="1547"/>
           </w:tcPr>
           <w:p>
             <w:r>
@@ -16195,8 +16125,7 @@
         </w:tc>
         <w:tc>
           <w:tcPr>
-            <w:tcW w:w="1601" w:type="dxa"/>
-            <w:vAlign w:val="center"/>
+            <w:tcW w:type="dxa" w:w="1540"/>
           </w:tcPr>
           <w:p>
             <w:r>
@@ -16206,8 +16135,7 @@
         </w:tc>
         <w:tc>
           <w:tcPr>
-            <w:tcW w:w="1601" w:type="dxa"/>
-            <w:vAlign w:val="center"/>
+            <w:tcW w:type="dxa" w:w="1556"/>
           </w:tcPr>
           <w:p>
             <w:r>
@@ -16217,8 +16145,7 @@
         </w:tc>
         <w:tc>
           <w:tcPr>
-            <w:tcW w:w="1601" w:type="dxa"/>
-            <w:vAlign w:val="center"/>
+            <w:tcW w:type="dxa" w:w="1540"/>
           </w:tcPr>
           <w:p>
             <w:r>
@@ -16228,8 +16155,7 @@
         </w:tc>
         <w:tc>
           <w:tcPr>
-            <w:tcW w:w="1601" w:type="dxa"/>
-            <w:vAlign w:val="center"/>
+            <w:tcW w:type="dxa" w:w="1537"/>
           </w:tcPr>
           <w:p>
             <w:r>
@@ -16239,14 +16165,9 @@
         </w:tc>
       </w:tr>
       <w:tr>
-        <w:trPr>
-          <w:trHeight w:val="425"/>
-          <w:jc w:val="center"/>
-        </w:trPr>
-        <w:tc>
-          <w:tcPr>
-            <w:tcW w:w="1601" w:type="dxa"/>
-            <w:vAlign w:val="center"/>
+        <w:tc>
+          <w:tcPr>
+            <w:tcW w:type="dxa" w:w="1525"/>
           </w:tcPr>
           <w:p>
             <w:r>
@@ -16256,8 +16177,7 @@
         </w:tc>
         <w:tc>
           <w:tcPr>
-            <w:tcW w:w="1601" w:type="dxa"/>
-            <w:vAlign w:val="center"/>
+            <w:tcW w:type="dxa" w:w="1547"/>
           </w:tcPr>
           <w:p>
             <w:r>
@@ -16267,19 +16187,17 @@
         </w:tc>
         <w:tc>
           <w:tcPr>
-            <w:tcW w:w="1601" w:type="dxa"/>
-            <w:vAlign w:val="center"/>
-          </w:tcPr>
-          <w:p>
-            <w:r>
-              <w:t>Duplicate PAY-DEMO-001</w:t>
-            </w:r>
-          </w:p>
-        </w:tc>
-        <w:tc>
-          <w:tcPr>
-            <w:tcW w:w="1601" w:type="dxa"/>
-            <w:vAlign w:val="center"/>
+            <w:tcW w:type="dxa" w:w="1540"/>
+          </w:tcPr>
+          <w:p>
+            <w:r>
+              <w:t>Duplicate existing gateway ref</w:t>
+            </w:r>
+          </w:p>
+        </w:tc>
+        <w:tc>
+          <w:tcPr>
+            <w:tcW w:type="dxa" w:w="1556"/>
           </w:tcPr>
           <w:p>
             <w:r>
@@ -16289,8 +16207,7 @@
         </w:tc>
         <w:tc>
           <w:tcPr>
-            <w:tcW w:w="1601" w:type="dxa"/>
-            <w:vAlign w:val="center"/>
+            <w:tcW w:type="dxa" w:w="1540"/>
           </w:tcPr>
           <w:p>
             <w:r>
@@ -16300,8 +16217,7 @@
         </w:tc>
         <w:tc>
           <w:tcPr>
-            <w:tcW w:w="1601" w:type="dxa"/>
-            <w:vAlign w:val="center"/>
+            <w:tcW w:type="dxa" w:w="1537"/>
           </w:tcPr>
           <w:p>
             <w:r>
@@ -16311,14 +16227,9 @@
         </w:tc>
       </w:tr>
       <w:tr>
-        <w:trPr>
-          <w:trHeight w:val="425"/>
-          <w:jc w:val="center"/>
-        </w:trPr>
-        <w:tc>
-          <w:tcPr>
-            <w:tcW w:w="1601" w:type="dxa"/>
-            <w:vAlign w:val="center"/>
+        <w:tc>
+          <w:tcPr>
+            <w:tcW w:type="dxa" w:w="1525"/>
           </w:tcPr>
           <w:p>
             <w:r>
@@ -16328,19 +16239,17 @@
         </w:tc>
         <w:tc>
           <w:tcPr>
-            <w:tcW w:w="1601" w:type="dxa"/>
-            <w:vAlign w:val="center"/>
-          </w:tcPr>
-          <w:p>
-            <w:r>
-              <w:t>ENUM domain</w:t>
-            </w:r>
-          </w:p>
-        </w:tc>
-        <w:tc>
-          <w:tcPr>
-            <w:tcW w:w="1601" w:type="dxa"/>
-            <w:vAlign w:val="center"/>
+            <w:tcW w:type="dxa" w:w="1547"/>
+          </w:tcPr>
+          <w:p>
+            <w:r>
+              <w:t>ENUM status domain</w:t>
+            </w:r>
+          </w:p>
+        </w:tc>
+        <w:tc>
+          <w:tcPr>
+            <w:tcW w:type="dxa" w:w="1540"/>
           </w:tcPr>
           <w:p>
             <w:r>
@@ -16350,30 +16259,27 @@
         </w:tc>
         <w:tc>
           <w:tcPr>
-            <w:tcW w:w="1601" w:type="dxa"/>
-            <w:vAlign w:val="center"/>
-          </w:tcPr>
-          <w:p>
-            <w:r>
-              <w:t>Truncated/ENUM error</w:t>
-            </w:r>
-          </w:p>
-        </w:tc>
-        <w:tc>
-          <w:tcPr>
-            <w:tcW w:w="1601" w:type="dxa"/>
-            <w:vAlign w:val="center"/>
-          </w:tcPr>
-          <w:p>
-            <w:r>
-              <w:t>Truncated/ENUM error</w:t>
-            </w:r>
-          </w:p>
-        </w:tc>
-        <w:tc>
-          <w:tcPr>
-            <w:tcW w:w="1601" w:type="dxa"/>
-            <w:vAlign w:val="center"/>
+            <w:tcW w:type="dxa" w:w="1556"/>
+          </w:tcPr>
+          <w:p>
+            <w:r>
+              <w:t>ENUM/truncation error</w:t>
+            </w:r>
+          </w:p>
+        </w:tc>
+        <w:tc>
+          <w:tcPr>
+            <w:tcW w:type="dxa" w:w="1540"/>
+          </w:tcPr>
+          <w:p>
+            <w:r>
+              <w:t>Error as expected</w:t>
+            </w:r>
+          </w:p>
+        </w:tc>
+        <w:tc>
+          <w:tcPr>
+            <w:tcW w:type="dxa" w:w="1537"/>
           </w:tcPr>
           <w:p>
             <w:r>
@@ -16383,14 +16289,9 @@
         </w:tc>
       </w:tr>
       <w:tr>
-        <w:trPr>
-          <w:trHeight w:val="425"/>
-          <w:jc w:val="center"/>
-        </w:trPr>
-        <w:tc>
-          <w:tcPr>
-            <w:tcW w:w="1601" w:type="dxa"/>
-            <w:vAlign w:val="center"/>
+        <w:tc>
+          <w:tcPr>
+            <w:tcW w:type="dxa" w:w="1525"/>
           </w:tcPr>
           <w:p>
             <w:r>
@@ -16400,8 +16301,7 @@
         </w:tc>
         <w:tc>
           <w:tcPr>
-            <w:tcW w:w="1601" w:type="dxa"/>
-            <w:vAlign w:val="center"/>
+            <w:tcW w:type="dxa" w:w="1547"/>
           </w:tcPr>
           <w:p>
             <w:r>
@@ -16411,8 +16311,7 @@
         </w:tc>
         <w:tc>
           <w:tcPr>
-            <w:tcW w:w="1601" w:type="dxa"/>
-            <w:vAlign w:val="center"/>
+            <w:tcW w:type="dxa" w:w="1540"/>
           </w:tcPr>
           <w:p>
             <w:r>
@@ -16422,8 +16321,7 @@
         </w:tc>
         <w:tc>
           <w:tcPr>
-            <w:tcW w:w="1601" w:type="dxa"/>
-            <w:vAlign w:val="center"/>
+            <w:tcW w:type="dxa" w:w="1556"/>
           </w:tcPr>
           <w:p>
             <w:r>
@@ -16433,8 +16331,7 @@
         </w:tc>
         <w:tc>
           <w:tcPr>
-            <w:tcW w:w="1601" w:type="dxa"/>
-            <w:vAlign w:val="center"/>
+            <w:tcW w:type="dxa" w:w="1540"/>
           </w:tcPr>
           <w:p>
             <w:r>
@@ -16444,8 +16341,7 @@
         </w:tc>
         <w:tc>
           <w:tcPr>
-            <w:tcW w:w="1601" w:type="dxa"/>
-            <w:vAlign w:val="center"/>
+            <w:tcW w:type="dxa" w:w="1537"/>
           </w:tcPr>
           <w:p>
             <w:r>
@@ -16455,14 +16351,9 @@
         </w:tc>
       </w:tr>
       <w:tr>
-        <w:trPr>
-          <w:trHeight w:val="425"/>
-          <w:jc w:val="center"/>
-        </w:trPr>
-        <w:tc>
-          <w:tcPr>
-            <w:tcW w:w="1601" w:type="dxa"/>
-            <w:vAlign w:val="center"/>
+        <w:tc>
+          <w:tcPr>
+            <w:tcW w:type="dxa" w:w="1525"/>
           </w:tcPr>
           <w:p>
             <w:r>
@@ -16472,41 +16363,37 @@
         </w:tc>
         <w:tc>
           <w:tcPr>
-            <w:tcW w:w="1601" w:type="dxa"/>
-            <w:vAlign w:val="center"/>
-          </w:tcPr>
-          <w:p>
-            <w:r>
-              <w:t>sp_process_refund state guard</w:t>
-            </w:r>
-          </w:p>
-        </w:tc>
-        <w:tc>
-          <w:tcPr>
-            <w:tcW w:w="1601" w:type="dxa"/>
-            <w:vAlign w:val="center"/>
-          </w:tcPr>
-          <w:p>
-            <w:r>
-              <w:t>CALL on Approved (not Inspected) return</w:t>
-            </w:r>
-          </w:p>
-        </w:tc>
-        <w:tc>
-          <w:tcPr>
-            <w:tcW w:w="1601" w:type="dxa"/>
-            <w:vAlign w:val="center"/>
-          </w:tcPr>
-          <w:p>
-            <w:r>
-              <w:t>Error ‘must be Inspected’</w:t>
-            </w:r>
-          </w:p>
-        </w:tc>
-        <w:tc>
-          <w:tcPr>
-            <w:tcW w:w="1601" w:type="dxa"/>
-            <w:vAlign w:val="center"/>
+            <w:tcW w:type="dxa" w:w="1547"/>
+          </w:tcPr>
+          <w:p>
+            <w:r>
+              <w:t>Procedure state guard</w:t>
+            </w:r>
+          </w:p>
+        </w:tc>
+        <w:tc>
+          <w:tcPr>
+            <w:tcW w:type="dxa" w:w="1540"/>
+          </w:tcPr>
+          <w:p>
+            <w:r>
+              <w:t>db_ops refund on Requested return</w:t>
+            </w:r>
+          </w:p>
+        </w:tc>
+        <w:tc>
+          <w:tcPr>
+            <w:tcW w:type="dxa" w:w="1556"/>
+          </w:tcPr>
+          <w:p>
+            <w:r>
+              <w:t>Error 'must be Inspected'</w:t>
+            </w:r>
+          </w:p>
+        </w:tc>
+        <w:tc>
+          <w:tcPr>
+            <w:tcW w:type="dxa" w:w="1540"/>
           </w:tcPr>
           <w:p>
             <w:r>
@@ -16516,8 +16403,7 @@
         </w:tc>
         <w:tc>
           <w:tcPr>
-            <w:tcW w:w="1601" w:type="dxa"/>
-            <w:vAlign w:val="center"/>
+            <w:tcW w:type="dxa" w:w="1537"/>
           </w:tcPr>
           <w:p>
             <w:r>
@@ -16527,14 +16413,9 @@
         </w:tc>
       </w:tr>
       <w:tr>
-        <w:trPr>
-          <w:trHeight w:val="425"/>
-          <w:jc w:val="center"/>
-        </w:trPr>
-        <w:tc>
-          <w:tcPr>
-            <w:tcW w:w="1601" w:type="dxa"/>
-            <w:vAlign w:val="center"/>
+        <w:tc>
+          <w:tcPr>
+            <w:tcW w:type="dxa" w:w="1525"/>
           </w:tcPr>
           <w:p>
             <w:r>
@@ -16544,52 +16425,47 @@
         </w:tc>
         <w:tc>
           <w:tcPr>
-            <w:tcW w:w="1601" w:type="dxa"/>
-            <w:vAlign w:val="center"/>
-          </w:tcPr>
-          <w:p>
-            <w:r>
-              <w:t>Full lifecycle integration</w:t>
-            </w:r>
-          </w:p>
-        </w:tc>
-        <w:tc>
-          <w:tcPr>
-            <w:tcW w:w="1601" w:type="dxa"/>
-            <w:vAlign w:val="center"/>
-          </w:tcPr>
-          <w:p>
-            <w:r>
-              <w:t>API: order→return→approve→receive→inspect→refund</w:t>
-            </w:r>
-          </w:p>
-        </w:tc>
-        <w:tc>
-          <w:tcPr>
-            <w:tcW w:w="1601" w:type="dxa"/>
-            <w:vAlign w:val="center"/>
-          </w:tcPr>
-          <w:p>
-            <w:r>
-              <w:t>201/200 chain, status Refunded</w:t>
-            </w:r>
-          </w:p>
-        </w:tc>
-        <w:tc>
-          <w:tcPr>
-            <w:tcW w:w="1601" w:type="dxa"/>
-            <w:vAlign w:val="center"/>
-          </w:tcPr>
-          <w:p>
-            <w:r>
-              <w:t>Refunded end-to-end</w:t>
-            </w:r>
-          </w:p>
-        </w:tc>
-        <w:tc>
-          <w:tcPr>
-            <w:tcW w:w="1601" w:type="dxa"/>
-            <w:vAlign w:val="center"/>
+            <w:tcW w:type="dxa" w:w="1547"/>
+          </w:tcPr>
+          <w:p>
+            <w:r>
+              <w:t>Full lifecycle (db_ops)</w:t>
+            </w:r>
+          </w:p>
+        </w:tc>
+        <w:tc>
+          <w:tcPr>
+            <w:tcW w:type="dxa" w:w="1540"/>
+          </w:tcPr>
+          <w:p>
+            <w:r>
+              <w:t>Chain order→return→refund + reports</w:t>
+            </w:r>
+          </w:p>
+        </w:tc>
+        <w:tc>
+          <w:tcPr>
+            <w:tcW w:type="dxa" w:w="1556"/>
+          </w:tcPr>
+          <w:p>
+            <w:r>
+              <w:t>Refunded + audit entries</w:t>
+            </w:r>
+          </w:p>
+        </w:tc>
+        <w:tc>
+          <w:tcPr>
+            <w:tcW w:type="dxa" w:w="1540"/>
+          </w:tcPr>
+          <w:p>
+            <w:r>
+              <w:t>Refunded + audited</w:t>
+            </w:r>
+          </w:p>
+        </w:tc>
+        <w:tc>
+          <w:tcPr>
+            <w:tcW w:type="dxa" w:w="1537"/>
           </w:tcPr>
           <w:p>
             <w:r>
@@ -16615,7 +16491,7 @@
           </w:tcPr>
           <w:p>
             <w:r>
-              <w:t>Rollback on error (FIX 03)</w:t>
+              <w:t>Atomic rollback</w:t>
             </w:r>
           </w:p>
         </w:tc>
@@ -16625,7 +16501,7 @@
           </w:tcPr>
           <w:p>
             <w:r>
-              <w:t>CALL sp_process_refund (99999,99999)</w:t>
+              <w:t>process_refund(99999,99999)</w:t>
             </w:r>
           </w:p>
         </w:tc>
@@ -16635,7 +16511,7 @@
           </w:tcPr>
           <w:p>
             <w:r>
-              <w:t>ROLLBACK; zero Refund rows</w:t>
+              <w:t>AppError; zero Refund rows</w:t>
             </w:r>
           </w:p>
         </w:tc>
@@ -16677,7 +16553,7 @@
           </w:tcPr>
           <w:p>
             <w:r>
-              <w:t>Concurrent duplicate refund (FIX 02)</w:t>
+              <w:t>Late + duplicate guards</w:t>
             </w:r>
           </w:p>
         </w:tc>
@@ -16687,7 +16563,7 @@
           </w:tcPr>
           <w:p>
             <w:r>
-              <w:t>2 parallel POST refund threads</w:t>
+              <w:t>Order-3 late return; 2nd refund</w:t>
             </w:r>
           </w:p>
         </w:tc>
@@ -16697,7 +16573,7 @@
           </w:tcPr>
           <w:p>
             <w:r>
-              <w:t>Exactly 1×200 + 1×400</w:t>
+              <w:t>Window-expiry + duplicate errors</w:t>
             </w:r>
           </w:p>
         </w:tc>
@@ -16707,7 +16583,7 @@
           </w:tcPr>
           <w:p>
             <w:r>
-              <w:t>1×200 + 1×400 observed</w:t>
+              <w:t>Both blocked</w:t>
             </w:r>
           </w:p>
         </w:tc>
@@ -16739,7 +16615,7 @@
           </w:tcPr>
           <w:p>
             <w:r>
-              <w:t>Streamlit auth + RBAC</w:t>
+              <w:t>Auth + RBAC</w:t>
             </w:r>
           </w:p>
         </w:tc>
@@ -16749,7 +16625,7 @@
           </w:tcPr>
           <w:p>
             <w:r>
-              <w:t>Login 4 demo roles; wrong password</w:t>
+              <w:t>4 role logins; bad password</w:t>
             </w:r>
           </w:p>
         </w:tc>
@@ -16759,7 +16635,7 @@
           </w:tcPr>
           <w:p>
             <w:r>
-              <w:t>Roles resolved; invalid rejected</w:t>
+              <w:t>Roles resolved; rejection</w:t>
             </w:r>
           </w:p>
         </w:tc>
@@ -16770,192 +16646,6 @@
           <w:p>
             <w:r>
               <w:t>Roles resolved; rejected</w:t>
-            </w:r>
-          </w:p>
-        </w:tc>
-        <w:tc>
-          <w:tcPr>
-            <w:tcW w:type="dxa" w:w="1537"/>
-          </w:tcPr>
-          <w:p>
-            <w:r>
-              <w:t>Pass</w:t>
-            </w:r>
-          </w:p>
-        </w:tc>
-      </w:tr>
-      <w:tr>
-        <w:tc>
-          <w:tcPr>
-            <w:tcW w:type="dxa" w:w="1525"/>
-          </w:tcPr>
-          <w:p>
-            <w:r>
-              <w:t>TC-11</w:t>
-            </w:r>
-          </w:p>
-        </w:tc>
-        <w:tc>
-          <w:tcPr>
-            <w:tcW w:type="dxa" w:w="1547"/>
-          </w:tcPr>
-          <w:p>
-            <w:r>
-              <w:t>Streamlit lifecycle (db_ops)</w:t>
-            </w:r>
-          </w:p>
-        </w:tc>
-        <w:tc>
-          <w:tcPr>
-            <w:tcW w:type="dxa" w:w="1540"/>
-          </w:tcPr>
-          <w:p>
-            <w:r>
-              <w:t>db_ops chain order→refund</w:t>
-            </w:r>
-          </w:p>
-        </w:tc>
-        <w:tc>
-          <w:tcPr>
-            <w:tcW w:type="dxa" w:w="1556"/>
-          </w:tcPr>
-          <w:p>
-            <w:r>
-              <w:t>Refunded + audit entries</w:t>
-            </w:r>
-          </w:p>
-        </w:tc>
-        <w:tc>
-          <w:tcPr>
-            <w:tcW w:type="dxa" w:w="1540"/>
-          </w:tcPr>
-          <w:p>
-            <w:r>
-              <w:t>Refunded + audited</w:t>
-            </w:r>
-          </w:p>
-        </w:tc>
-        <w:tc>
-          <w:tcPr>
-            <w:tcW w:type="dxa" w:w="1537"/>
-          </w:tcPr>
-          <w:p>
-            <w:r>
-              <w:t>Pass</w:t>
-            </w:r>
-          </w:p>
-        </w:tc>
-      </w:tr>
-      <w:tr>
-        <w:tc>
-          <w:tcPr>
-            <w:tcW w:type="dxa" w:w="1525"/>
-          </w:tcPr>
-          <w:p>
-            <w:r>
-              <w:t>TC-12</w:t>
-            </w:r>
-          </w:p>
-        </w:tc>
-        <w:tc>
-          <w:tcPr>
-            <w:tcW w:type="dxa" w:w="1547"/>
-          </w:tcPr>
-          <w:p>
-            <w:r>
-              <w:t>Streamlit guards</w:t>
-            </w:r>
-          </w:p>
-        </w:tc>
-        <w:tc>
-          <w:tcPr>
-            <w:tcW w:type="dxa" w:w="1540"/>
-          </w:tcPr>
-          <w:p>
-            <w:r>
-              <w:t>Late return (order 3); 2nd refund</w:t>
-            </w:r>
-          </w:p>
-        </w:tc>
-        <w:tc>
-          <w:tcPr>
-            <w:tcW w:type="dxa" w:w="1556"/>
-          </w:tcPr>
-          <w:p>
-            <w:r>
-              <w:t>Window-expiry + duplicate errors</w:t>
-            </w:r>
-          </w:p>
-        </w:tc>
-        <w:tc>
-          <w:tcPr>
-            <w:tcW w:type="dxa" w:w="1540"/>
-          </w:tcPr>
-          <w:p>
-            <w:r>
-              <w:t>Both blocked as expected</w:t>
-            </w:r>
-          </w:p>
-        </w:tc>
-        <w:tc>
-          <w:tcPr>
-            <w:tcW w:type="dxa" w:w="1537"/>
-          </w:tcPr>
-          <w:p>
-            <w:r>
-              <w:t>Pass</w:t>
-            </w:r>
-          </w:p>
-        </w:tc>
-      </w:tr>
-      <w:tr>
-        <w:tc>
-          <w:tcPr>
-            <w:tcW w:type="dxa" w:w="1525"/>
-          </w:tcPr>
-          <w:p>
-            <w:r>
-              <w:t>TC-13</w:t>
-            </w:r>
-          </w:p>
-        </w:tc>
-        <w:tc>
-          <w:tcPr>
-            <w:tcW w:type="dxa" w:w="1547"/>
-          </w:tcPr>
-          <w:p>
-            <w:r>
-              <w:t>Catalogue + analytics sanity</w:t>
-            </w:r>
-          </w:p>
-        </w:tc>
-        <w:tc>
-          <w:tcPr>
-            <w:tcW w:type="dxa" w:w="1540"/>
-          </w:tcPr>
-          <w:p>
-            <w:r>
-              <w:t>list_products; return-rates query</w:t>
-            </w:r>
-          </w:p>
-        </w:tc>
-        <w:tc>
-          <w:tcPr>
-            <w:tcW w:type="dxa" w:w="1556"/>
-          </w:tcPr>
-          <w:p>
-            <w:r>
-              <w:t>&gt;=5 products/rates rows</w:t>
-            </w:r>
-          </w:p>
-        </w:tc>
-        <w:tc>
-          <w:tcPr>
-            <w:tcW w:type="dxa" w:w="1540"/>
-          </w:tcPr>
-          <w:p>
-            <w:r>
-              <w:t>Rows returned</w:t>
             </w:r>
           </w:p>
         </w:tc>
@@ -16999,7 +16689,7 @@
         </w:rPr>
       </w:pPr>
       <w:r>
-        <w:t>Key results: 13/13 tests passed (100%: 9 API + 4 Streamlit ops). Constraints (TC-01–TC-05) prove the engine rejects bad quantities, negative amounts, duplicate gateway references, illegal ENUM states, and restricted deletes. TC-06/TC-08 prove the procedure guards state and rolls back fully on error with no orphan rows. TC-07 proves the API-to-database chain completes Order→Refunded through all six states. TC-09 proves exactly-once refund under concurrency (one 200, one 400). TC-10 proves Streamlit bcrypt login resolves all four RBAC roles and rejects bad passwords. TC-11 proves the Streamlit data layer (db_ops) drives the same full lifecycle with explicit transactions and audit entries. TC-12 proves the late-return window trigger and duplicate-refund guard fire through db_ops identically. Benchmarks (benchmarks/run_benchmarks.py): pending-returns median 0.22 ms (1K indexed) to 2.95 ms (100K indexed); sp_process_refund median 1.23 ms; mysqldump backup/restore of 111,025 orders verified with checksum PASS. Together this confirms both the Streamlit application and the API harness correctly use the designed database and enforce all critical business rules [7].</w:t>
+        <w:t>Key results: 10/10 tests passed (100%, TC-01–TC-10, Streamlit suite). Constraint tests (TC-01–TC-05) prove the engine rejects bad quantities, negative amounts, duplicate gateway references, illegal ENUM states, and restricted deletes — independent of any client. TC-06 proves the procedure refuses non-Inspected returns through the same db_ops path the UI calls. TC-07 proves the full Order→Refunded chain with audit entries and working catalogue/analytics queries. TC-08 proves atomic rollback with zero orphan rows. TC-09 proves the late-return window trigger and the exactly-once refund guard. TC-10 proves bcrypt login resolves all four RBAC roles and rejects bad passwords. Benchmarks (benchmarks/run_benchmarks.py): pending-returns median 0.22 ms (1K indexed) to 2.95 ms (100K indexed); sp_process_refund median 1.23 ms; mysqldump backup/restore of 111,025 orders verified with checksum PASS. Together this confirms the Streamlit application correctly uses the designed database and enforces all critical business rules [6].</w:t>
       </w:r>
     </w:p>
     <w:p>
@@ -17181,7 +16871,7 @@
         </w:rPr>
       </w:pPr>
       <w:r>
-        <w:t>This project addressed scattered, unauditable e-commerce after-sales handling by delivering a centralized MySQL 8 DBMS and a FastAPI dashboard for the full order-to-refund lifecycle. The 13-table 3NF design with PK/FK, CHECK, UNIQUE, ENUM, and RESTRICT rules was implemented with five triggers and the atomic sp_process_refund procedure, and all 17 REST endpoints operate directly on this database through parameterized SQL with JWT RBAC. The system implements ordering, item-level returns, support approval, warehouse receive/inspection, exactly-once refunds with GOOD-condition restocking, immutable auditing, and six operational/analytical reports. Validation achieved 13/13 automated tests, indexed query performance to 100K scale, and verified disaster-recovery integrity. The outcome is a single queryable source of truth with enforced eligibility, state discipline, and traceable refunds, and hands-on mastery of ER modelling, normalization, triggers, transactions, API-backed DBMS development, and empirical testing.</w:t>
+        <w:t>This project addressed scattered, unauditable e-commerce after-sales handling by delivering a centralized MySQL 8 DBMS and a role-based Streamlit application for the full order-to-refund lifecycle. The 13-table 3NF design with PK/FK, CHECK, UNIQUE, ENUM, and RESTRICT rules was implemented with five triggers and the atomic sp_process_refund procedure, and all six Streamlit pages operate directly on this database through parameterized SQL with bcrypt login and session-state RBAC. The system implements ordering, item-level returns, support approval, warehouse receive/inspection, exactly-once refunds with GOOD-condition restocking, immutable auditing, and six operational/analytical reports. Validation achieved 10/10 automated tests, indexed query performance to 100K scale, and verified disaster-recovery integrity. The outcome is a single queryable source of truth with enforced eligibility, state discipline, and traceable refunds, and hands-on mastery of ER modelling, normalization, triggers, transactions, Streamlit-backed DBMS development, and empirical testing.</w:t>
       </w:r>
     </w:p>
     <w:p>
@@ -17413,7 +17103,24 @@
         </w:rPr>
       </w:pPr>
       <w:r>
-        <w:t>[6] S. Ramírez, FastAPI Documentation — Modern Python Web APIs. Accessed: Oct. 8, 2026. [Online]. Available: https://fastapi.tiangolo.com/</w:t>
+        <w:t>[6] Python Software Foundation, mysql-connector-python Developer Guide (parameterized queries and transactions). Accessed: Oct. 8, 2026. [Online]. Available: https://dev.mysql.com/doc/connector-python/en/</w:t>
+      </w:r>
+    </w:p>
+    <w:p>
+      <w:pPr>
+        <w:pStyle w:val="ListParagraph"/>
+        <w:numPr>
+          <w:ilvl w:val="0"/>
+          <w:numId w:val="10"/>
+        </w:numPr>
+        <w:ind w:hanging="720"/>
+        <w:rPr>
+          <w:rFonts w:cs="Times New Roman"/>
+          <w:color w:val="000000" w:themeColor="text1"/>
+        </w:rPr>
+      </w:pPr>
+      <w:r>
+        <w:t>[7] Streamlit Inc., Streamlit Documentation — Build data apps in Python. Accessed: Oct. 11, 2026. [Online]. Available: https://docs.streamlit.io/</w:t>
       </w:r>
     </w:p>
     <w:p/>
@@ -18167,7 +17874,7 @@
         </w:rPr>
       </w:pPr>
       <w:r>
-        <w:t>Appendix B (ecommerce_refund_dbms/): streamlit_app/app.py (6 role-gated pages: Customer Portal, Operations, Refunds, Analytics, Audit Log, Lifecycle Demo), streamlit_app/db_ops.py (parameterized operations + AppError surfacing of trigger/procedure messages), backend/ retained as test/benchmark harness (17 REST endpoints: main.py, auth.py bcrypt+JWT, database.py connector, payment_gateway.py mock), frontend/index.html (legacy SPA), tests/test_streamlit_ops.py (TC-10–TC-13), benchmarks/run_benchmarks.py, docker-compose.yml. Run: streamlit run streamlit_app/app.py --server.port 8501 → http://127.0.0.1:8501. Demo logins (password123): customer_user / support_agent / warehouse_op / admin_user.</w:t>
+        <w:t>Appendix B (ecommerce_refund_dbms/): streamlit_app/app.py (6 role-gated pages: Customer Portal, Operations, Refunds, Analytics, Audit Log, Lifecycle Demo), streamlit_app/db_ops.py (parameterized operations + AppError surfacing of trigger/procedure messages), streamlit_app/database.py (pooled MySQL connector), auth.py (bcrypt), payment_gateway.py (mock), tests/test_streamlit_ops.py (TC-01–TC-10), db/*.sql (schema, triggers, procedures, indexes, queries), benchmarks/run_benchmarks.py. Run: streamlit run streamlit_app/app.py --server.port 8501 → http://127.0.0.1:8501. Demo logins (password123): customer_user / support_agent / warehouse_op / admin_user.</w:t>
       </w:r>
     </w:p>
     <w:p>
@@ -18227,7 +17934,7 @@
         </w:rPr>
       </w:pPr>
       <w:r>
-        <w:t>Appendix C: docs/screenshots/ (customer_portal, ops_dashboard, api_flow 7-state stepper, access_denied_403, audit_log, analytics_dashboard, blocked_late_return, test_run_output 13/13, benchmark_chart); docs/er_diagram.png + .mmd; docs/REPORT.md (inventory metrics); docs/test_report.md (13-test matrix); Presentations/PPT1–PPT3 (Review 1–3). Extra evidence below: return-lifecycle state diagram and three-layer architecture. Streamlit screens: st_customer_portal, st_ops_dashboard, st_analytics, st_audit_log, st_lifecycle.</w:t>
+        <w:t>Appendix C: docs/screenshots/ (st_customer_portal, st_ops_dashboard, st_analytics, st_audit_log, st_lifecycle, st_blocked_return, test_run_output 10/10, benchmark_chart); docs/er_diagram.png + .mmd; docs/REPORT.md; docs/test_report.md (TC-01–TC-10 matrix); Presentations/PPT1–PPT3 + PPT3_Script.md. Extra evidence below: return-lifecycle state diagram and three-layer architecture.</w:t>
       </w:r>
     </w:p>
     <w:p>
@@ -18321,7 +18028,7 @@
         <w:jc w:val="center"/>
       </w:pPr>
       <w:r>
-        <w:t>Figure 7. Three-layer system architecture: SPA client, FastAPI + JWT service, MySQL 8 data layer</w:t>
+        <w:t>Figure 7. Three-layer system architecture: Streamlit app (direct SQL), MySQL 8 data layer</w:t>
       </w:r>
     </w:p>
     <w:p>
@@ -18345,7 +18052,7 @@
                     <pic:cNvPicPr/>
                   </pic:nvPicPr>
                   <pic:blipFill>
-                    <a:blip r:embed="rId26"/>
+                    <a:blip r:embed="rId27"/>
                     <a:stretch>
                       <a:fillRect/>
                     </a:stretch>
@@ -18369,7 +18076,7 @@
         <w:jc w:val="center"/>
       </w:pPr>
       <w:r>
-        <w:t>Figure 8. Automated test evidence — pytest 13/13 passed (9 API + 4 Streamlit ops tests)</w:t>
+        <w:t>Figure 8. Automated test evidence — pytest 10/10 passed (TC-01–TC-10, Streamlit suite)</w:t>
       </w:r>
     </w:p>
     <w:p>
@@ -18423,11 +18130,12 @@
       <w:pPr>
         <w:jc w:val="center"/>
       </w:pPr>
+      <w:r/>
       <w:r>
         <w:drawing>
           <wp:inline xmlns:a="http://schemas.openxmlformats.org/drawingml/2006/main" xmlns:pic="http://schemas.openxmlformats.org/drawingml/2006/picture">
             <wp:extent cx="5486400" cy="3526971"/>
-            <wp:docPr id="1486609555" name="Picture 1486609555"/>
+            <wp:docPr id="1486609561" name="Picture 1486609561"/>
             <wp:cNvGraphicFramePr>
               <a:graphicFrameLocks noChangeAspect="1"/>
             </wp:cNvGraphicFramePr>
@@ -18435,11 +18143,11 @@
               <a:graphicData uri="http://schemas.openxmlformats.org/drawingml/2006/picture">
                 <pic:pic>
                   <pic:nvPicPr>
-                    <pic:cNvPr id="0" name="blocked_late_return.png"/>
+                    <pic:cNvPr id="0" name="st_blocked_return.png"/>
                     <pic:cNvPicPr/>
                   </pic:nvPicPr>
                   <pic:blipFill>
-                    <a:blip r:embed="rId21"/>
+                    <a:blip r:embed="rId28"/>
                     <a:stretch>
                       <a:fillRect/>
                     </a:stretch>
@@ -18463,7 +18171,7 @@
         <w:jc w:val="center"/>
       </w:pPr>
       <w:r>
-        <w:t>Figure 10. Business-rule evidence — trigger blocks late return outside product window (Order 3, 45 days vs 7-day window)</w:t>
+        <w:t>Figure 10. Business-rule evidence — Streamlit late-return guard: trigger blocks Order 3 (45 days vs 7-day window)</w:t>
       </w:r>
     </w:p>
     <w:sectPr>

</xml_diff>